<commit_message>
Insert full reference list into Word manuscript draft
</commit_message>
<xml_diff>
--- a/manuscript/RA-MARS-journal-draft-with-figures.docx
+++ b/manuscript/RA-MARS-journal-draft-with-figures.docx
@@ -5055,7 +5055,7 @@
       </w:tr>
     </w:tbl>
     <w:bookmarkEnd w:id="85"/>
-    <w:bookmarkStart w:id="86" w:name="table-mission-recovery-time"/>
+    <w:bookmarkStart w:id="88" w:name="table-mission-recovery-time"/>
     <w:p>
       <w:pPr>
         <w:pStyle w:val="Heading1"/>
@@ -5527,7 +5527,431 @@
         </w:tc>
       </w:tr>
     </w:tbl>
+    <w:bookmarkStart w:id="86" w:name="references"/>
+    <w:p>
+      <w:pPr>
+        <w:pStyle w:val="Heading2"/>
+      </w:pPr>
+      <w:r>
+        <w:t xml:space="preserve">References</w:t>
+      </w:r>
+    </w:p>
+    <w:p>
+      <w:pPr>
+        <w:pStyle w:val="FirstParagraph"/>
+      </w:pPr>
+      <w:r>
+        <w:t xml:space="preserve">[1] P. Stodola, J. Nohel, and L. Horák, “Dynamic reconnaissance operations with UAV swarms: adapting to environmental changes,” Scientific Reports, 2025.</w:t>
+      </w:r>
+    </w:p>
+    <w:p>
+      <w:pPr>
+        <w:pStyle w:val="BodyText"/>
+      </w:pPr>
+      <w:r>
+        <w:t xml:space="preserve">[2] S. Bi, K. Li, S. Hu, W. Ni, C. Wang, and X. Wang, “Detection and Mitigation of Position Spoofing Attacks on Cooperative UAV Swarm Formations,” IEEE Transactions on Information Forensics and Security, 2024.</w:t>
+      </w:r>
+    </w:p>
+    <w:p>
+      <w:pPr>
+        <w:pStyle w:val="BodyText"/>
+      </w:pPr>
+      <w:r>
+        <w:t xml:space="preserve">[3] P. Mykytyn, M. Brzozowski, Z. Dyka, and P. Langendoerfer, “GPS-Spoofing Attack Detection Mechanism for UAV Swarms,” 2023 IEEE Mediterranean Conference on Embedded Computing, 2023.</w:t>
+      </w:r>
+    </w:p>
+    <w:p>
+      <w:pPr>
+        <w:pStyle w:val="BodyText"/>
+      </w:pPr>
+      <w:r>
+        <w:t xml:space="preserve">[4] L. Alhoraibi, D. Alghazzawi, and R. Alhebshi, “Detection of GPS Spoofing Attacks in UAVs Based on Adversarial Machine Learning Model,” Sensors, vol. 24, no. 18, article 6156, 2024.</w:t>
+      </w:r>
+    </w:p>
+    <w:p>
+      <w:pPr>
+        <w:pStyle w:val="BodyText"/>
+      </w:pPr>
+      <w:r>
+        <w:t xml:space="preserve">[5] G. Wang, X. Lv, and X. Yan, “A Two-Stage Distributed Task Assignment Algorithm Based on Contract Net Protocol for Multi-UAV Cooperative Reconnaissance Task Reassignment in Dynamic Environments,” Sensors, vol. 23, no. 18, article 7980, 2023.</w:t>
+      </w:r>
+    </w:p>
+    <w:p>
+      <w:pPr>
+        <w:pStyle w:val="BodyText"/>
+      </w:pPr>
+      <w:r>
+        <w:t xml:space="preserve">[6] Z. Lv, L. Xiao, Y. Du, G. Niu, C. Xing, and W. Xu, “Multi-Agent Reinforcement Learning Based UAV Swarm Communications Against Jamming,” IEEE Transactions on Wireless Communications, vol. 22, pp. 9063–9075, 2023.</w:t>
+      </w:r>
+    </w:p>
+    <w:p>
+      <w:pPr>
+        <w:pStyle w:val="BodyText"/>
+      </w:pPr>
+      <w:r>
+        <w:t xml:space="preserve">[7] J. Ghelani, P. Gharia, and H. El-Ocla, “Gradient Monitored Reinforcement Learning for Jamming Attack Detection in FANETs,” IEEE Access, vol. 12, pp. 23081–23095, 2024.</w:t>
+      </w:r>
+    </w:p>
+    <w:p>
+      <w:pPr>
+        <w:pStyle w:val="BodyText"/>
+      </w:pPr>
+      <w:r>
+        <w:t xml:space="preserve">[8] Z. Lv, L. Xiao, Y. Chen, H. Chen, and X. Ji, “Safe Multi-Agent Reinforcement Learning for Wireless Applications Against Adversarial Communications,” IEEE Transactions on Information Forensics and Security, vol. 19, pp. 6824–6839, 2024.</w:t>
+      </w:r>
+    </w:p>
+    <w:p>
+      <w:pPr>
+        <w:pStyle w:val="BodyText"/>
+      </w:pPr>
+      <w:r>
+        <w:t xml:space="preserve">[9] C. Greco, P. Pace, S. Basagni, and G. Fortino, “Jamming Detection at the Edge of Drone Networks Using Multi-layer Perceptrons and Decision Trees,” Applied Soft Computing, vol. 111, article 107806, 2021.</w:t>
+      </w:r>
+    </w:p>
+    <w:p>
+      <w:pPr>
+        <w:pStyle w:val="BodyText"/>
+      </w:pPr>
+      <w:r>
+        <w:t xml:space="preserve">[10] Z. Shao, H. Yang, L. Xiao, W. Su, Y. Chen, and Z. Xiong, “Deep Reinforcement Learning-Based Resource Management for UAV-Assisted Mobile Edge Computing Against Jamming,” IEEE Transactions on Mobile Computing, vol. 23, no. 12, pp. 13358–13374, 2024.</w:t>
+      </w:r>
+    </w:p>
+    <w:p>
+      <w:pPr>
+        <w:pStyle w:val="BodyText"/>
+      </w:pPr>
+      <w:r>
+        <w:t xml:space="preserve">[11] Z. Yu, Z. Wang, J. Yu, D. Liu, H. H. Song, and Z. Li, “Cybersecurity of Unmanned Aerial Vehicles: A Survey,” IEEE Aerospace and Electronic Systems Magazine, vol. 39, no. 9, pp. 182–215, 2024.</w:t>
+      </w:r>
+    </w:p>
+    <w:p>
+      <w:pPr>
+        <w:pStyle w:val="BodyText"/>
+      </w:pPr>
+      <w:r>
+        <w:t xml:space="preserve">[12] Y. Mekdad, A. Aris, L. Babun, A. El Fergougui, M. Conti, R. Lazzeretti, and A. S. Uluagac, “A Survey on Security and Privacy Issues of UAVs,” Computer Networks, vol. 224, article 109626, 2023.</w:t>
+      </w:r>
+    </w:p>
+    <w:p>
+      <w:pPr>
+        <w:pStyle w:val="BodyText"/>
+      </w:pPr>
+      <w:r>
+        <w:t xml:space="preserve">[13] Z. Wang, K. Han, Y. Yang, and W. Tian, “A Survey on Cybersecurity Attacks and Defenses for Unmanned Aerial Systems,” Journal of Systems Architecture, vol. 138, article 102870, 2023.</w:t>
+      </w:r>
+    </w:p>
+    <w:p>
+      <w:pPr>
+        <w:pStyle w:val="BodyText"/>
+      </w:pPr>
+      <w:r>
+        <w:t xml:space="preserve">[14] N. Bai, S. Wang, T. Zhang, N. N. Xiong, and S. Li, “A Survey on Unmanned Aerial Systems Cybersecurity,” Journal of Systems Architecture, vol. 156, article 103282, 2024.</w:t>
+      </w:r>
+    </w:p>
+    <w:p>
+      <w:pPr>
+        <w:pStyle w:val="BodyText"/>
+      </w:pPr>
+      <w:r>
+        <w:t xml:space="preserve">[15] R. Sarenche, F. Aghili, T. Yoshizawa, and D. Singelée, “DASLog: Decentralized Auditable Secure Logging for UAV Ecosystems,” IEEE Internet of Things Journal, vol. 10, no. 23, pp. 20264–20284, 2023.</w:t>
+      </w:r>
+    </w:p>
+    <w:p>
+      <w:pPr>
+        <w:pStyle w:val="BodyText"/>
+      </w:pPr>
+      <w:r>
+        <w:t xml:space="preserve">[16] R. Karmakar, G. Kaddoum, and O. Akhrif, “A Blockchain-Based Distributed and Intelligent Clustering-Enabled Authentication Protocol for UAV Swarms,” IEEE Transactions on Mobile Computing, 2024.</w:t>
+      </w:r>
+    </w:p>
+    <w:p>
+      <w:pPr>
+        <w:pStyle w:val="BodyText"/>
+      </w:pPr>
+      <w:r>
+        <w:t xml:space="preserve">[17] R. Xiong, Q. Xiao, Z. Wang, Z. Xu, and F. Shan, “Leveraging Lightweight Blockchain for Secure Collaborative Computing in UAV Ad-Hoc Networks,” Computer Networks, vol. 251, article 110612, 2024.</w:t>
+      </w:r>
+    </w:p>
+    <w:p>
+      <w:pPr>
+        <w:pStyle w:val="BodyText"/>
+      </w:pPr>
+      <w:r>
+        <w:t xml:space="preserve">[18] X. Tang, X. Lan, L. Li, Y. Zhang, and Z. Han, “Incentivizing Proof-of-Stake Blockchain for Secured Data Collection in UAV-Assisted IoT: A Multi-Agent Reinforcement Learning Approach,” IEEE Journal on Selected Areas in Communications, vol. 40, no. 12, pp. 3470–3484, 2022.</w:t>
+      </w:r>
+    </w:p>
+    <w:p>
+      <w:pPr>
+        <w:pStyle w:val="BodyText"/>
+      </w:pPr>
+      <w:r>
+        <w:t xml:space="preserve">[19] S. Hafeez, A. R. Khan, M. Al-Quraan, L. Mohjazi, A. Zoha, M. A. Imran, and Y. Sun, “Blockchain-Assisted UAV Communication Systems: A Comprehensive Survey,” IEEE Open Journal of Vehicular Technology, vol. 4, pp. 558–580, 2023.</w:t>
+      </w:r>
+    </w:p>
+    <w:p>
+      <w:pPr>
+        <w:pStyle w:val="BodyText"/>
+      </w:pPr>
+      <w:r>
+        <w:t xml:space="preserve">[20] L. Liu and J. Yang, “A Dynamic Mission Abort Policy for the Swarm Executing Missions and Its Solution Method by Tailored Deep Reinforcement Learning,” Reliability Engineering &amp; System Safety, vol. 234, article 109149, 2023.</w:t>
+      </w:r>
+    </w:p>
+    <w:p>
+      <w:pPr>
+        <w:pStyle w:val="BodyText"/>
+      </w:pPr>
+      <w:r>
+        <w:t xml:space="preserve">[21] X. Zhou, Y. Huang, G. Bai, B. Xu, and J. Tao, “The Resilience Evaluation of Unmanned Autonomous Swarm with Informed Agents under Partial Failure,” Reliability Engineering &amp; System Safety, vol. 244, article 109920, 2024.</w:t>
+      </w:r>
+    </w:p>
+    <w:p>
+      <w:pPr>
+        <w:pStyle w:val="BodyText"/>
+      </w:pPr>
+      <w:r>
+        <w:t xml:space="preserve">[22] T. Liu, G. Bai, J. Tao, Y. Zhang, and Y. Fang, “A Multistate Network Approach for Resilience Analysis of UAV Swarm Considering Information Exchange Capacity,” Reliability Engineering &amp; System Safety, vol. 241, article 109606, 2024.</w:t>
+      </w:r>
+    </w:p>
+    <w:p>
+      <w:pPr>
+        <w:pStyle w:val="BodyText"/>
+      </w:pPr>
+      <w:r>
+        <w:t xml:space="preserve">[23] Q. Sun, H. Li, Y. Zhong, K. Ren, and Y. Zhang, “Deep Reinforcement Learning-Based Resilience Enhancement Strategy of Unmanned Weapon System-of-Systems under Inevitable Interferences,” Reliability Engineering &amp; System Safety, vol. 242, article 109749, 2024.</w:t>
+      </w:r>
+    </w:p>
+    <w:p>
+      <w:pPr>
+        <w:pStyle w:val="BodyText"/>
+      </w:pPr>
+      <w:r>
+        <w:t xml:space="preserve">[24] C. Zhang, T. Liu, G. Bai, J. Tao, and W. Zhu, “A Dynamic Resilience Evaluation Method for Cross-Domain Swarms in Confrontation,” Reliability Engineering &amp; System Safety, vol. 244, article 109904, 2024.</w:t>
+      </w:r>
+    </w:p>
+    <w:p>
+      <w:pPr>
+        <w:pStyle w:val="BodyText"/>
+      </w:pPr>
+      <w:r>
+        <w:t xml:space="preserve">[25] S. C. Hassler, U. A. Mughal, and M. Ismail, “Cyber-Physical Intrusion Detection System for Unmanned Aerial Vehicles,” IEEE Transactions on Intelligent Transportation Systems, vol. 25, no. 6, pp. 6106–6117, 2024.</w:t>
+      </w:r>
+    </w:p>
+    <w:p>
+      <w:pPr>
+        <w:pStyle w:val="BodyText"/>
+      </w:pPr>
+      <w:r>
+        <w:t xml:space="preserve">[26] H. J. Hadi, Y. Cao, S. Li, Y. Hu, J. Wang, and S. Wang, “Real-Time Collaborative Intrusion Detection System in UAV Networks Using Deep Learning,” IEEE Internet of Things Journal, vol. 11, no. 20, pp. 33371–33391, 2024.</w:t>
+      </w:r>
+    </w:p>
+    <w:p>
+      <w:pPr>
+        <w:pStyle w:val="BodyText"/>
+      </w:pPr>
+      <w:r>
+        <w:t xml:space="preserve">[27] R. A. AL-Syouf, R. M. Bani-Hani, and O. Y. AL-Jarrah, “Machine Learning Approaches to Intrusion Detection in Unmanned Aerial Vehicles (UAVs),” Neural Computing and Applications, vol. 36, no. 29, pp. 18009–18041, 2024.</w:t>
+      </w:r>
+    </w:p>
+    <w:p>
+      <w:pPr>
+        <w:pStyle w:val="BodyText"/>
+      </w:pPr>
+      <w:r>
+        <w:t xml:space="preserve">[28] J. Medhi, R. Liu, Q. Wang, and X. Chen, “A Lightweight and Efficient Intrusion Detection System (IDS) for Unmanned Aerial Vehicles,” Neural Computing and Applications, vol. 37, no. 20, pp. 15819–15836, 2025.</w:t>
+      </w:r>
+    </w:p>
+    <w:p>
+      <w:pPr>
+        <w:pStyle w:val="BodyText"/>
+      </w:pPr>
+      <w:r>
+        <w:t xml:space="preserve">[29] Y. Luo, Y. Xiao, L. Cheng, G. Peng, and D. Yao, “Deep Learning-Based Anomaly Detection in Cyber-Physical Systems: Progress and Opportunities,” ACM Computing Surveys, vol. 54, no. 5, article 106, 2021.</w:t>
+      </w:r>
+    </w:p>
+    <w:p>
+      <w:pPr>
+        <w:pStyle w:val="BodyText"/>
+      </w:pPr>
+      <w:r>
+        <w:t xml:space="preserve">[30] L. Xiang, F. Wang, W. Xu, T. Zhang, M. Pan, and Z. Han, “Dynamic UAV Swarm Collaboration for Multi-Targets Tracking Under Malicious Jamming: Joint Power, Path and Target Association Optimization,” IEEE Transactions on Vehicular Technology, vol. 73, no. 4, pp. 5410–5425, 2024.</w:t>
+      </w:r>
+    </w:p>
+    <w:p>
+      <w:pPr>
+        <w:pStyle w:val="BodyText"/>
+      </w:pPr>
+      <w:r>
+        <w:t xml:space="preserve">[31] Z. Yin, J. Li, Z. Wang, Y. Qian, Y. Lin, F. Shu, and W. Chen, “UAV Communication Against Intelligent Jamming: A Stackelberg Game Approach With Federated Reinforcement Learning,” IEEE Transactions on Green Communications and Networking, vol. 8, no. 4, pp. 1796–1808, 2024.</w:t>
+      </w:r>
+    </w:p>
+    <w:p>
+      <w:pPr>
+        <w:pStyle w:val="BodyText"/>
+      </w:pPr>
+      <w:r>
+        <w:t xml:space="preserve">[32] Y. Su, N. Qi, Z. Huang, R. Yao, and L. Jia, “Cooperative Anti-Jamming and Interference Mitigation for UAV Networks: A Local Altruistic Game Approach,” China Communications, vol. 21, no. 2, pp. 183–196, 2024.</w:t>
+      </w:r>
+    </w:p>
+    <w:p>
+      <w:pPr>
+        <w:pStyle w:val="BodyText"/>
+      </w:pPr>
+      <w:r>
+        <w:t xml:space="preserve">[33] C. Fang, Y. Feng, X. Li, and Y. Yang, “Multi-UAV Energy-Efficient Detection Coverage Under Jamming Environment: A Hierarchical Collaborative Learning Approach,” IEEE Transactions on Vehicular Technology, vol. 74, pp. 7351–7363, 2025.</w:t>
+      </w:r>
+    </w:p>
+    <w:p>
+      <w:pPr>
+        <w:pStyle w:val="BodyText"/>
+      </w:pPr>
+      <w:r>
+        <w:t xml:space="preserve">[34] X. Ma, M. Gao, Y. Zhao, and M. Yu, “A Novel Navigation Spoofing Algorithm for UAV Based on GPS/INS-Integrated Navigation,” IEEE Transactions on Vehicular Technology, vol. 73, no. 10, pp. 15424–15439, 2024.</w:t>
+      </w:r>
+    </w:p>
+    <w:p>
+      <w:pPr>
+        <w:pStyle w:val="BodyText"/>
+      </w:pPr>
+      <w:r>
+        <w:t xml:space="preserve">[35] S. A. Negru, P. Geragersian, I. Petrunin, and W. Guo, “Resilient Multi-Sensor UAV Navigation with a Hybrid Federated Fusion Architecture,” Sensors, vol. 24, no. 3, article 981, 2024.</w:t>
+      </w:r>
+    </w:p>
+    <w:p>
+      <w:pPr>
+        <w:pStyle w:val="BodyText"/>
+      </w:pPr>
+      <w:r>
+        <w:t xml:space="preserve">[36] I. Jarraya, A. Al-Batati, M. B. Kadri, M. Abdelkader, A. Ammar, W. Boulila, and A. Koubaa, “GNSS-Denied Unmanned Aerial Vehicle Navigation: Analyzing Computational Complexity, Sensor Fusion, and Localization Methodologies,” Satellite Navigation, vol. 6, article 9, 2025.</w:t>
+      </w:r>
+    </w:p>
+    <w:p>
+      <w:pPr>
+        <w:pStyle w:val="BodyText"/>
+      </w:pPr>
+      <w:r>
+        <w:t xml:space="preserve">[37] C. Meng, Q. Hu, S. S. Ge, and D. Li, “Trusted Multisource Fusion Navigation for UAV Under GNSS Interference and Spoofing Attacks,” IEEE/ASME Transactions on Mechatronics, vol. 30, no. 6, pp. 4165–4175, 2025.</w:t>
+      </w:r>
+    </w:p>
+    <w:p>
+      <w:pPr>
+        <w:pStyle w:val="BodyText"/>
+      </w:pPr>
+      <w:r>
+        <w:t xml:space="preserve">[38] Y. Zeng, Z. Lu, X. Zhao, Z. Xiao, S. Ni, Z. Han, and K. Li, “GNSS Jamming and Spoofing Threats in UAV Navigation: Countermeasure Status and Challenges,” IEEE Communications Surveys &amp; Tutorials, vol. 28, pp. 5909–5948, 2026.</w:t>
+      </w:r>
+    </w:p>
+    <w:p>
+      <w:pPr>
+        <w:pStyle w:val="BodyText"/>
+      </w:pPr>
+      <w:r>
+        <w:t xml:space="preserve">[39] B. Zhao, M. Huo, Z. Li, W. Feng, Z. Yu, N. Qi, and S. Wang, “Graph-Based Multi-Agent Reinforcement Learning for Collaborative Search and Tracking of Multiple UAVs,” Chinese Journal of Aeronautics, vol. 38, no. 3, article 103214, 2025.</w:t>
+      </w:r>
+    </w:p>
+    <w:p>
+      <w:pPr>
+        <w:pStyle w:val="BodyText"/>
+      </w:pPr>
+      <w:r>
+        <w:t xml:space="preserve">[40] Z. Zhang, J. Jiang, H. Xu, and W.-A. Zhang, “Distributed Dynamic Task Allocation for Unmanned Aerial Vehicle Swarm Systems: A Networked Evolutionary Game-Theoretic Approach,” Chinese Journal of Aeronautics, vol. 37, no. 6, pp. 182–204, 2024.</w:t>
+      </w:r>
+    </w:p>
+    <w:p>
+      <w:pPr>
+        <w:pStyle w:val="BodyText"/>
+      </w:pPr>
+      <w:r>
+        <w:t xml:space="preserve">[41] D. Liu, L. Dou, R. Zhang, X. Zhang, and Q. Zong, “Multi-Agent Reinforcement Learning-Based Coordinated Dynamic Task Allocation for Heterogeneous UAVs,” IEEE Transactions on Vehicular Technology, vol. 72, no. 4, pp. 4372–4383, 2023.</w:t>
+      </w:r>
+    </w:p>
+    <w:p>
+      <w:pPr>
+        <w:pStyle w:val="BodyText"/>
+      </w:pPr>
+      <w:r>
+        <w:t xml:space="preserve">[42] K. Li, J. Liu, X. Gu, Y. Yang, C. Chang, H. Chen, L. Wan, and Y. Lin, “Dynamic Decision-Making of UAV Swarm Based on Constrained Multi-Objective Optimization Under Incomplete Interference Information,” Chinese Journal of Aeronautics, article 103846, 2025.</w:t>
+      </w:r>
+    </w:p>
+    <w:p>
+      <w:pPr>
+        <w:pStyle w:val="BodyText"/>
+      </w:pPr>
+      <w:r>
+        <w:t xml:space="preserve">[43] X. Wang, Z. Zhao, L. Yi, Z. Ning, L. Guo, F. R. Yu, and S. Guo, “A Survey on Security of UAV Swarm Networks: Attacks and Countermeasures,” ACM Computing Surveys, vol. 57, no. 3, article 3703625, 2024.</w:t>
+      </w:r>
+    </w:p>
     <w:bookmarkEnd w:id="86"/>
+    <w:bookmarkStart w:id="87" w:name="next-cleanup-tasks"/>
+    <w:p>
+      <w:pPr>
+        <w:pStyle w:val="Heading2"/>
+      </w:pPr>
+      <w:r>
+        <w:t xml:space="preserve">Next Cleanup Tasks</w:t>
+      </w:r>
+    </w:p>
+    <w:p>
+      <w:pPr>
+        <w:pStyle w:val="Compact"/>
+        <w:numPr>
+          <w:ilvl w:val="0"/>
+          <w:numId w:val="1003"/>
+        </w:numPr>
+      </w:pPr>
+      <w:r>
+        <w:t xml:space="preserve">Add missing DOI values.</w:t>
+      </w:r>
+    </w:p>
+    <w:p>
+      <w:pPr>
+        <w:pStyle w:val="Compact"/>
+        <w:numPr>
+          <w:ilvl w:val="0"/>
+          <w:numId w:val="1003"/>
+        </w:numPr>
+      </w:pPr>
+      <w:r>
+        <w:t xml:space="preserve">Verify page ranges.</w:t>
+      </w:r>
+    </w:p>
+    <w:p>
+      <w:pPr>
+        <w:pStyle w:val="Compact"/>
+        <w:numPr>
+          <w:ilvl w:val="0"/>
+          <w:numId w:val="1003"/>
+        </w:numPr>
+      </w:pPr>
+      <w:r>
+        <w:t xml:space="preserve">Remove any weak references if needed.</w:t>
+      </w:r>
+    </w:p>
+    <w:p>
+      <w:pPr>
+        <w:pStyle w:val="Compact"/>
+        <w:numPr>
+          <w:ilvl w:val="0"/>
+          <w:numId w:val="1003"/>
+        </w:numPr>
+      </w:pPr>
+      <w:r>
+        <w:t xml:space="preserve">Convert to final Elsevier reference format.</w:t>
+      </w:r>
+    </w:p>
+    <w:p>
+      <w:pPr>
+        <w:pStyle w:val="Compact"/>
+        <w:numPr>
+          <w:ilvl w:val="0"/>
+          <w:numId w:val="1003"/>
+        </w:numPr>
+      </w:pPr>
+      <w:r>
+        <w:t xml:space="preserve">Align in-text citations with final numbering.</w:t>
+      </w:r>
+    </w:p>
+    <w:bookmarkEnd w:id="87"/>
+    <w:bookmarkEnd w:id="88"/>
     <w:sectPr>
       <w:footnotePr>
         <w:numRestart w:val="eachSect"/>
@@ -5861,6 +6285,9 @@
     <w:lvlOverride w:ilvl="8">
       <w:startOverride w:val="1"/>
     </w:lvlOverride>
+  </w:num>
+  <w:num w:numId="1003">
+    <w:abstractNumId w:val="991"/>
   </w:num>
 </w:numbering>
 </file>

</xml_diff>